<commit_message>
Iniziato sviluppo gestione dipendenti
</commit_message>
<xml_diff>
--- a/Lezione 1/Lezione 1.docx
+++ b/Lezione 1/Lezione 1.docx
@@ -630,6 +630,19 @@
       <w:r>
         <w:lastRenderedPageBreak/>
         <w:t>controller che raccolgono dei metodi di utilità, ovvero che offrono delle funzionalità di lavoro utilizzabile in ambito applicativo, per implementare delle funzionalità specifiche.</w:t>
+      </w:r>
+    </w:p>
+    <w:p>
+      <w:r>
+        <w:t>Applicando i pattern si seguono delle regole ben precise, sviluppati mediante il supporto di Ingegneria del software.</w:t>
+      </w:r>
+    </w:p>
+    <w:p>
+      <w:r>
+        <w:t>Prima regola da rispettare per il model: gli attributi sono tutti privati</w:t>
+      </w:r>
+      <w:r>
+        <w:t>. String è maiuscolo in quanto String è una classe, mentre int o float sono tipi primitivi.</w:t>
       </w:r>
     </w:p>
     <w:p/>

</xml_diff>